<commit_message>
Credit full author name: Vedant Charegaonkar (README + overview doc)
</commit_message>
<xml_diff>
--- a/Atomberg-Video-Support-Overview.docx
+++ b/Atomberg-Video-Support-Overview.docx
@@ -33,6 +33,21 @@
           <w:szCs w:val="24"/>
         </w:rPr>
         <w:t xml:space="preserve">A self-owned, real-time video support platform</w:t>
+      </w:r>
+    </w:p>
+    <w:p>
+      <w:pPr>
+        <w:spacing w:after="240"/>
+        <w:jc w:val="center"/>
+      </w:pPr>
+      <w:r>
+        <w:rPr>
+          <w:b/>
+          <w:color w:val="1A1407"/>
+          <w:sz w:val="22"/>
+          <w:szCs w:val="22"/>
+        </w:rPr>
+        <w:t xml:space="preserve">Created by Vedant Charegaonkar</w:t>
       </w:r>
     </w:p>
     <w:p>

</xml_diff>

<commit_message>
Add Loom demo link (README + doc) and a technical architecture diagram on the doc's last page
</commit_message>
<xml_diff>
--- a/Atomberg-Video-Support-Overview.docx
+++ b/Atomberg-Video-Support-Overview.docx
@@ -21,7 +21,7 @@
     </w:p>
     <w:p>
       <w:pPr>
-        <w:spacing w:after="240"/>
+        <w:spacing w:after="60"/>
         <w:jc w:val="center"/>
       </w:pPr>
       <w:r>
@@ -37,18 +37,44 @@
     </w:p>
     <w:p>
       <w:pPr>
-        <w:spacing w:after="240"/>
+        <w:spacing w:after="40"/>
         <w:jc w:val="center"/>
       </w:pPr>
       <w:r>
         <w:rPr>
           <w:b/>
+          <w:bCs/>
           <w:color w:val="1A1407"/>
           <w:sz w:val="22"/>
           <w:szCs w:val="22"/>
         </w:rPr>
         <w:t xml:space="preserve">Created by Vedant Charegaonkar</w:t>
       </w:r>
+    </w:p>
+    <w:p>
+      <w:pPr>
+        <w:spacing w:after="240"/>
+        <w:jc w:val="center"/>
+      </w:pPr>
+      <w:r>
+        <w:rPr>
+          <w:b/>
+          <w:bCs/>
+          <w:sz w:val="20"/>
+          <w:szCs w:val="20"/>
+        </w:rPr>
+        <w:t xml:space="preserve">Demo video: </w:t>
+      </w:r>
+      <w:hyperlink w:history="1" r:id="rId34ksbnw-bga-mdeadiq3v">
+        <w:r>
+          <w:rPr>
+            <w:rStyle w:val="Hyperlink"/>
+            <w:sz w:val="20"/>
+            <w:szCs w:val="20"/>
+          </w:rPr>
+          <w:t xml:space="preserve">https://www.loom.com/share/d50dba236c1c438689e1cf0699c71f0f</w:t>
+        </w:r>
+      </w:hyperlink>
     </w:p>
     <w:p>
       <w:pPr>
@@ -859,9 +885,29 @@
           <w:b/>
           <w:bCs/>
         </w:rPr>
+        <w:t xml:space="preserve">Demo video (Loom): </w:t>
+      </w:r>
+      <w:hyperlink w:history="1" r:id="rIduzrxlxfqqcgtm6l7rmkzs">
+        <w:r>
+          <w:rPr>
+            <w:rStyle w:val="Hyperlink"/>
+          </w:rPr>
+          <w:t xml:space="preserve">https://www.loom.com/share/d50dba236c1c438689e1cf0699c71f0f</w:t>
+        </w:r>
+      </w:hyperlink>
+    </w:p>
+    <w:p>
+      <w:pPr>
+        <w:spacing w:after="60"/>
+      </w:pPr>
+      <w:r>
+        <w:rPr>
+          <w:b/>
+          <w:bCs/>
+        </w:rPr>
         <w:t xml:space="preserve">Live (deployed): </w:t>
       </w:r>
-      <w:hyperlink w:history="1" r:id="rId-x4rlj0iedgkgjfspz1qk">
+      <w:hyperlink w:history="1" r:id="rIdic1m0m-5wl7cbkmqmxzmy">
         <w:r>
           <w:rPr>
             <w:rStyle w:val="Hyperlink"/>
@@ -881,7 +927,7 @@
         </w:rPr>
         <w:t xml:space="preserve">Source code: </w:t>
       </w:r>
-      <w:hyperlink w:history="1" r:id="rId4wkh9np_l4oxtitzd8x-m">
+      <w:hyperlink w:history="1" r:id="rIdasxvqwl36tyjec8qsouhc">
         <w:r>
           <w:rPr>
             <w:rStyle w:val="Hyperlink"/>
@@ -900,6 +946,121 @@
       </w:r>
       <w:r>
         <w:t xml:space="preserve">the cloud link shows the full app — sign-in, request form, dashboards, chat. For the actual camera-to-camera call, run it locally (npm install, npm run seed, npm start, then open two browser windows), because cloud serverless hosting does not pass the type of network traffic live video needs.</w:t>
+      </w:r>
+    </w:p>
+    <w:p>
+      <w:pPr>
+        <w:pStyle w:val="Heading1"/>
+        <w:pageBreakBefore/>
+      </w:pPr>
+      <w:r>
+        <w:t xml:space="preserve">Technical architecture</w:t>
+      </w:r>
+    </w:p>
+    <w:p>
+      <w:pPr>
+        <w:spacing w:after="120"/>
+      </w:pPr>
+      <w:r>
+        <w:t xml:space="preserve">A closer look at the same system — the real components and the media path through the server.</w:t>
+      </w:r>
+    </w:p>
+    <w:p>
+      <w:pPr>
+        <w:spacing w:after="120"/>
+        <w:jc w:val="center"/>
+      </w:pPr>
+      <w:r>
+        <w:drawing>
+          <wp:inline distT="0" distB="0" distL="0" distR="0">
+            <wp:extent cx="6286500" cy="4800600"/>
+            <wp:effectExtent t="0" r="0" b="0" l="0"/>
+            <wp:docPr id="1" name="tech-architecture" descr="Browsers run getUserMedia + one RTCPeerConnection and a Socket.IO client. The server runs Socket.IO signaling, the werift SFU that forwards RTP between per-client peer connections, an Express REST API with JWT and role middleware, node:sqlite storage, WebM recordings, file uploads, and prom-client metrics." title="Technical architecture"/>
+            <wp:cNvGraphicFramePr>
+              <a:graphicFrameLocks xmlns:a="http://schemas.openxmlformats.org/drawingml/2006/main" noChangeAspect="1"/>
+            </wp:cNvGraphicFramePr>
+            <a:graphic xmlns:a="http://schemas.openxmlformats.org/drawingml/2006/main">
+              <a:graphicData uri="http://schemas.openxmlformats.org/drawingml/2006/picture">
+                <pic:pic xmlns:pic="http://schemas.openxmlformats.org/drawingml/2006/picture">
+                  <pic:nvPicPr>
+                    <pic:cNvPr id="0" name="" descr=""/>
+                    <pic:cNvPicPr>
+                      <a:picLocks noChangeAspect="1" noChangeArrowheads="1"/>
+                    </pic:cNvPicPr>
+                  </pic:nvPicPr>
+                  <pic:blipFill>
+                    <a:blip r:embed="rId8" cstate="none"/>
+                    <a:srcRect/>
+                    <a:stretch>
+                      <a:fillRect/>
+                    </a:stretch>
+                  </pic:blipFill>
+                  <pic:spPr bwMode="auto">
+                    <a:xfrm>
+                      <a:off x="0" y="0"/>
+                      <a:ext cx="6286500" cy="4800600"/>
+                    </a:xfrm>
+                    <a:prstGeom prst="rect">
+                      <a:avLst/>
+                    </a:prstGeom>
+                  </pic:spPr>
+                </pic:pic>
+              </a:graphicData>
+            </a:graphic>
+          </wp:inline>
+        </w:drawing>
+      </w:r>
+    </w:p>
+    <w:p>
+      <w:pPr>
+        <w:pStyle w:val="ListParagraph"/>
+        <w:numPr>
+          <w:ilvl w:val="0"/>
+          <w:numId w:val="2"/>
+        </w:numPr>
+        <w:spacing w:after="60"/>
+      </w:pPr>
+      <w:r>
+        <w:t xml:space="preserve">Signaling vs media are separate: Socket.IO (WebSocket) carries SDP/ICE and chat; the actual audio/video is WebRTC over UDP (DTLS-SRTP).</w:t>
+      </w:r>
+    </w:p>
+    <w:p>
+      <w:pPr>
+        <w:pStyle w:val="ListParagraph"/>
+        <w:numPr>
+          <w:ilvl w:val="0"/>
+          <w:numId w:val="2"/>
+        </w:numPr>
+        <w:spacing w:after="60"/>
+      </w:pPr>
+      <w:r>
+        <w:t xml:space="preserve">The SFU keeps one RTCPeerConnection per client and forwards RTP from each one into the other peer’s connection — relay tracks, payload-type/ssrc rewrite, and RTCP PLI for keyframes.</w:t>
+      </w:r>
+    </w:p>
+    <w:p>
+      <w:pPr>
+        <w:pStyle w:val="ListParagraph"/>
+        <w:numPr>
+          <w:ilvl w:val="0"/>
+          <w:numId w:val="2"/>
+        </w:numPr>
+        <w:spacing w:after="60"/>
+      </w:pPr>
+      <w:r>
+        <w:t xml:space="preserve">SDP is serialized through a promise chain on both client and server (with polite-peer rollback) to avoid offer "glare" when the second person joins.</w:t>
+      </w:r>
+    </w:p>
+    <w:p>
+      <w:pPr>
+        <w:pStyle w:val="ListParagraph"/>
+        <w:numPr>
+          <w:ilvl w:val="0"/>
+          <w:numId w:val="2"/>
+        </w:numPr>
+        <w:spacing w:after="60"/>
+      </w:pPr>
+      <w:r>
+        <w:t xml:space="preserve">Everything is pure-JS / prebuilt — werift for WebRTC, node:sqlite for storage, werift’s MediaRecorder for WebM — so there is no native build, no ffmpeg, and no Docker required to run it.</w:t>
       </w:r>
     </w:p>
     <w:sectPr>

</xml_diff>